<commit_message>
Enfin affichage du bon nom de l'autorisation d'absence
</commit_message>
<xml_diff>
--- a/backend/templates/word/autorisation_absence_template.docx
+++ b/backend/templates/word/autorisation_absence_template.docx
@@ -755,7 +755,7 @@
           <w:sz w:val="26"/>
           <w:szCs w:val="26"/>
         </w:rPr>
-        <w:t xml:space="preserve">                                                                                  </w:t>
+        <w:t xml:space="preserve">                                                                                 </w:t>
       </w:r>
       <w:r>
         <w:rPr>
@@ -773,7 +773,7 @@
           <w:sz w:val="26"/>
           <w:szCs w:val="26"/>
         </w:rPr>
-        <w:t xml:space="preserve"> {{DATE_AUJOURDH_HUI}}</w:t>
+        <w:t xml:space="preserve"> {{DATE_AUJOURD_HUI}}</w:t>
       </w:r>
     </w:p>
     <w:p>

</xml_diff>

<commit_message>
Modifcation de quelques css
</commit_message>
<xml_diff>
--- a/backend/templates/word/autorisation_absence_template.docx
+++ b/backend/templates/word/autorisation_absence_template.docx
@@ -560,7 +560,7 @@
                                       </pic:cNvPicPr>
                                     </pic:nvPicPr>
                                     <pic:blipFill>
-                                      <a:blip r:embed="rId7">
+                                      <a:blip r:embed="rId9">
                                         <a:extLst>
                                           <a:ext uri="{28A0092B-C50C-407E-A947-70E740481C1C}">
                                             <a14:useLocalDpi xmlns:a14="http://schemas.microsoft.com/office/drawing/2010/main" val="0"/>
@@ -676,7 +676,7 @@
                     <o:lock v:ext="edit" aspectratio="t"/>
                   </v:shapetype>
                   <v:shape id="Image 10" o:spid="_x0000_s1030" type="#_x0000_t75" alt="Description : G:\DIP2016\charte\armoirie-Benin.png" style="position:absolute;left:476;top:-666;width:7715;height:6476;visibility:visible;mso-wrap-style:square" o:gfxdata="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">
-                    <v:imagedata r:id="rId9" o:title="armoirie-Benin"/>
+                    <v:imagedata r:id="rId10" o:title="armoirie-Benin"/>
                     <v:path arrowok="t"/>
                     <o:lock v:ext="edit" aspectratio="f"/>
                   </v:shape>
@@ -1327,7 +1327,27 @@
           <w:sz w:val="26"/>
           <w:szCs w:val="26"/>
         </w:rPr>
-        <w:t>{{DATE_FIN}}</w:t>
+        <w:t>{{DATE_</w:t>
+      </w:r>
+      <w:r>
+        <w:rPr>
+          <w:rFonts w:ascii="Trebuchet MS" w:hAnsi="Trebuchet MS"/>
+          <w:bCs/>
+          <w:iCs/>
+          <w:sz w:val="26"/>
+          <w:szCs w:val="26"/>
+        </w:rPr>
+        <w:t>REPRISE</w:t>
+      </w:r>
+      <w:r>
+        <w:rPr>
+          <w:rFonts w:ascii="Trebuchet MS" w:hAnsi="Trebuchet MS"/>
+          <w:bCs/>
+          <w:iCs/>
+          <w:sz w:val="26"/>
+          <w:szCs w:val="26"/>
+        </w:rPr>
+        <w:t>}}</w:t>
       </w:r>
       <w:r>
         <w:rPr>
@@ -1839,7 +1859,7 @@
       </w:r>
     </w:p>
     <w:sectPr>
-      <w:footerReference w:type="default" r:id="rId10"/>
+      <w:footerReference w:type="default" r:id="rId11"/>
       <w:pgSz w:w="11906" w:h="16838"/>
       <w:pgMar w:top="357" w:right="1304" w:bottom="1418" w:left="1361" w:header="709" w:footer="709" w:gutter="0"/>
       <w:cols w:space="708"/>

</xml_diff>